<commit_message>
Add Patina, Ritz Carlton rate overhaul, flights section with points tracker
</commit_message>
<xml_diff>
--- a/Maldives Hotel Template for Claude Code.docx
+++ b/Maldives Hotel Template for Claude Code.docx
@@ -2410,6 +2410,66 @@
       <w:proofErr w:type="spellEnd"/>
       <w:r>
         <w:t>, Overwater Sunset, Breakfast)</w:t>
+      </w:r>
+    </w:p>
+    <w:p/>
+    <w:p/>
+    <w:p>
+      <w:r>
+        <w:t xml:space="preserve">I am writing a partial summary judgment motion on behalf of THR. I am an attorney and I am providing no confidential or privileged information into this. I am solely asking for </w:t>
+      </w:r>
+      <w:proofErr w:type="spellStart"/>
+      <w:r>
+        <w:t>Cowork</w:t>
+      </w:r>
+      <w:proofErr w:type="spellEnd"/>
+      <w:r>
+        <w:t xml:space="preserve"> through Secure Processes through Lexis Plugin Protege to draft a partial summary judgment motion/shell of document so that I can then independently fill in information and put my actual thoughts down. For this partial MSJ, act as if you are a brilliant Texas attorney. Always </w:t>
+      </w:r>
+      <w:proofErr w:type="gramStart"/>
+      <w:r>
+        <w:t>cite to</w:t>
+      </w:r>
+      <w:proofErr w:type="gramEnd"/>
+      <w:r>
+        <w:t xml:space="preserve"> where you </w:t>
+      </w:r>
+      <w:proofErr w:type="gramStart"/>
+      <w:r>
+        <w:t>found</w:t>
+      </w:r>
+      <w:proofErr w:type="gramEnd"/>
+      <w:r>
+        <w:t xml:space="preserve"> information when applicable. Do not invent citations or </w:t>
+      </w:r>
+      <w:proofErr w:type="gramStart"/>
+      <w:r>
+        <w:t>quote</w:t>
+      </w:r>
+      <w:proofErr w:type="gramEnd"/>
+      <w:r>
+        <w:t xml:space="preserve">. Do not hallucinate. This is Texas state court so citations should be to Texas state law cases, particularly in Tarrant County 67th district. The reason for this partial MSJ is that I believe the trial should really be about damages/what is the usual and customary rate. That should be the goal for the jury. Under that reasoning, in this MSJ assume that Cigna has essentially admitted that it underpaid and that it owes money. This should get rid of the underlying parts of breach outside of </w:t>
+      </w:r>
+      <w:proofErr w:type="gramStart"/>
+      <w:r>
+        <w:t>damages</w:t>
+      </w:r>
+      <w:proofErr w:type="gramEnd"/>
+      <w:r>
+        <w:t>. That should be the easier part to draft with clear elements even though it's assignment. The more difficult part is COUNT ONE – VIOLATIONS OF THE TEXAS INSURANCE CODE EMERGENCY CARE</w:t>
+      </w:r>
+    </w:p>
+    <w:p>
+      <w:r>
+        <w:t xml:space="preserve">STATUTES. This could act like breach of </w:t>
+      </w:r>
+      <w:proofErr w:type="gramStart"/>
+      <w:r>
+        <w:t>contract</w:t>
+      </w:r>
+      <w:proofErr w:type="gramEnd"/>
+      <w:r>
+        <w:t xml:space="preserve"> or it might.</w:t>
       </w:r>
     </w:p>
     <w:p/>

</xml_diff>